<commit_message>
Release v1.0.6: upload selection and settings dialogs
</commit_message>
<xml_diff>
--- a/docs/发票管理系统操作说明书-v1.0.5.docx
+++ b/docs/发票管理系统操作说明书-v1.0.5.docx
@@ -187,7 +187,7 @@
         <w:pStyle w:val="ListBullet"/>
       </w:pPr>
       <w:r>
-        <w:t>自动生成汇总清单 PDF、整理后的 PDF 副本、可打印队列和发票打印汇总档案 Excel。</w:t>
+        <w:t>自动生成汇总清单 PDF、横向 A5 的汇总合成 PDF、整理后的 PDF 副本、可打印队列和发票打印汇总档案 Excel。</w:t>
       </w:r>
     </w:p>
     <w:p>
@@ -1102,7 +1102,7 @@
               <w:rPr>
                 <w:b w:val="0"/>
               </w:rPr>
-              <w:t>汇总清单 PDF 不会进入上传列表。</w:t>
+              <w:t>按发票号码筛选票据及配套行程单，不上传汇总文件。</w:t>
             </w:r>
           </w:p>
         </w:tc>
@@ -2123,6 +2123,11 @@
       </w:r>
     </w:p>
     <w:p>
+      <w:r>
+        <w:t>同时会生成“汇总合成.pdf”，该文件按实际打印顺序合并汇总清单及各票据，使用横向 A5 版面，便于预览、留存或统一打印。</w:t>
+      </w:r>
+    </w:p>
+    <w:p>
       <w:pPr>
         <w:pStyle w:val="Heading2"/>
       </w:pPr>
@@ -2172,7 +2177,7 @@
     </w:p>
     <w:p>
       <w:r>
-        <w:t>点击“生成汇总清单并打开”后，系统会在来源目录生成“发票打印汇总档案.xlsx”，若已有同名文件将覆盖。归档文件包含出差日期、来源与输出目录、打印数量、各类费用、总计、在途和备注。</w:t>
+        <w:t>点击“生成汇总清单并打开”后，系统会在来源目录生成“发票打印汇总档案.xlsx”，若已有同名文件将覆盖。归档文件包含出差日期、来源与输出目录、打印数量、各类费用、总计和备注。</w:t>
       </w:r>
     </w:p>
     <w:p>
@@ -2188,7 +2193,7 @@
         <w:pStyle w:val="ListBullet"/>
       </w:pPr>
       <w:r>
-        <w:t>住宿均为普票时，归档中的住宿不含税金额、税额、合计保持为空；住宿专票会写入对应专票金额。</w:t>
+        <w:t>“住宿费”=住宿专票不含税金额+住宿普票全额；“税金”仅记录住宿专票税额。</w:t>
       </w:r>
     </w:p>
     <w:p>
@@ -2220,7 +2225,7 @@
         <w:pStyle w:val="ListNumber"/>
       </w:pPr>
       <w:r>
-        <w:t>在弹窗中确认待上传文件列表，填写或点击“选择文件夹”选择目标公共盘路径。</w:t>
+        <w:t>在弹窗中确认待上传文件列表，填写或点击“选择文件夹”选择目标公共盘路径。列表会包含文件名含已识别发票号码的票据 PDF 及配套网约车行程单。</w:t>
       </w:r>
     </w:p>
     <w:p>
@@ -2228,7 +2233,7 @@
         <w:pStyle w:val="ListNumber"/>
       </w:pPr>
       <w:r>
-        <w:t>点击 YES 后，系统复制票据 PDF 到目标目录；“汇总清单.pdf”不会被上传。</w:t>
+        <w:t>点击 YES 后，系统复制票据 PDF 到目标目录；“汇总清单.pdf”和“汇总合成.pdf”不会被上传。</w:t>
       </w:r>
     </w:p>
     <w:p>
@@ -2257,7 +2262,7 @@
     </w:p>
     <w:p>
       <w:r>
-        <w:t>从顶部菜单选择“设定”。左侧可切换“打印机设定”和“开机自启动”。</w:t>
+        <w:t>从顶部菜单选择“设定”，其中“打印机设定”和“开机自启动”分别打开独立的设定弹窗。</w:t>
       </w:r>
     </w:p>
     <w:p>
@@ -2273,7 +2278,7 @@
         <w:pStyle w:val="ListNumber"/>
       </w:pPr>
       <w:r>
-        <w:t>在“设定”中选择“打印机设定”。</w:t>
+        <w:t>从顶部菜单选择“设定 → 打印机设定”。</w:t>
       </w:r>
     </w:p>
     <w:p>
@@ -2313,7 +2318,7 @@
         <w:pStyle w:val="ListBullet"/>
       </w:pPr>
       <w:r>
-        <w:t>在“设定”中选择“开机自启动”，勾选“开启开机自启动”。</w:t>
+        <w:t>从顶部菜单选择“设定 → 开机自启动”，勾选“开启开机自启动”。</w:t>
       </w:r>
     </w:p>
     <w:p>
@@ -2856,7 +2861,7 @@
         <w:rPr>
           <w:color w:val="6B6257"/>
         </w:rPr>
-        <w:t>文档版本：v1.0.5　　生成日期：2026-08-05</w:t>
+        <w:t>文档版本：v1.0.5　　生成日期：2026-08-12</w:t>
       </w:r>
     </w:p>
     <w:sectPr>

</xml_diff>